<commit_message>
:construiction: working on diary planning
</commit_message>
<xml_diff>
--- a/public/planejamentoSemanal1.docx
+++ b/public/planejamentoSemanal1.docx
@@ -68,8 +68,8 @@
         <w:tblLook w:val="0000"/>
       </w:tblPr>
       <w:tblGrid>
-        <w:gridCol w:w="1410"/>
-        <w:gridCol w:w="3330"/>
+        <w:gridCol w:w="2425"/>
+        <w:gridCol w:w="2315"/>
         <w:gridCol w:w="2879"/>
         <w:gridCol w:w="2626"/>
         <w:gridCol w:w="2774"/>
@@ -141,167 +141,7 @@
                 <w:shd w:fill="auto" w:val="clear"/>
                 <w:vertAlign w:val="baseline"/>
               </w:rPr>
-              <w:t>{</w:t>
-            </w:r>
-            <w:r>
-              <w:rPr>
-                <w:rFonts w:eastAsia="Arial" w:cs="Arial" w:ascii="Arial" w:hAnsi="Arial"/>
-                <w:b/>
-                <w:i w:val="false"/>
-                <w:caps w:val="false"/>
-                <w:smallCaps w:val="false"/>
-                <w:strike w:val="false"/>
-                <w:dstrike w:val="false"/>
-                <w:color w:val="FFFFFF"/>
-                <w:position w:val="0"/>
-                <w:sz w:val="24"/>
-                <w:sz w:val="24"/>
-                <w:szCs w:val="24"/>
-                <w:u w:val="none"/>
-                <w:shd w:fill="auto" w:val="clear"/>
-                <w:vertAlign w:val="baseline"/>
-              </w:rPr>
-              <w:t>n</w:t>
-            </w:r>
-            <w:r>
-              <w:rPr>
-                <w:rFonts w:eastAsia="Arial" w:cs="Arial" w:ascii="Arial" w:hAnsi="Arial"/>
-                <w:b/>
-                <w:i w:val="false"/>
-                <w:caps w:val="false"/>
-                <w:smallCaps w:val="false"/>
-                <w:strike w:val="false"/>
-                <w:dstrike w:val="false"/>
-                <w:color w:val="FFFFFF"/>
-                <w:position w:val="0"/>
-                <w:sz w:val="24"/>
-                <w:sz w:val="24"/>
-                <w:szCs w:val="24"/>
-                <w:u w:val="none"/>
-                <w:shd w:fill="auto" w:val="clear"/>
-                <w:vertAlign w:val="baseline"/>
-              </w:rPr>
-              <w:t>o</w:t>
-            </w:r>
-            <w:r>
-              <w:rPr>
-                <w:rFonts w:eastAsia="Arial" w:cs="Arial" w:ascii="Arial" w:hAnsi="Arial"/>
-                <w:b/>
-                <w:i w:val="false"/>
-                <w:caps w:val="false"/>
-                <w:smallCaps w:val="false"/>
-                <w:strike w:val="false"/>
-                <w:dstrike w:val="false"/>
-                <w:color w:val="FFFFFF"/>
-                <w:position w:val="0"/>
-                <w:sz w:val="24"/>
-                <w:sz w:val="24"/>
-                <w:szCs w:val="24"/>
-                <w:u w:val="none"/>
-                <w:shd w:fill="auto" w:val="clear"/>
-                <w:vertAlign w:val="baseline"/>
-              </w:rPr>
-              <w:t>m</w:t>
-            </w:r>
-            <w:r>
-              <w:rPr>
-                <w:rFonts w:eastAsia="Arial" w:cs="Arial" w:ascii="Arial" w:hAnsi="Arial"/>
-                <w:b/>
-                <w:i w:val="false"/>
-                <w:caps w:val="false"/>
-                <w:smallCaps w:val="false"/>
-                <w:strike w:val="false"/>
-                <w:dstrike w:val="false"/>
-                <w:color w:val="FFFFFF"/>
-                <w:position w:val="0"/>
-                <w:sz w:val="24"/>
-                <w:sz w:val="24"/>
-                <w:szCs w:val="24"/>
-                <w:u w:val="none"/>
-                <w:shd w:fill="auto" w:val="clear"/>
-                <w:vertAlign w:val="baseline"/>
-              </w:rPr>
-              <w:t>e</w:t>
-            </w:r>
-            <w:r>
-              <w:rPr>
-                <w:rFonts w:eastAsia="Arial" w:cs="Arial" w:ascii="Arial" w:hAnsi="Arial"/>
-                <w:b/>
-                <w:i w:val="false"/>
-                <w:caps w:val="false"/>
-                <w:smallCaps w:val="false"/>
-                <w:strike w:val="false"/>
-                <w:dstrike w:val="false"/>
-                <w:color w:val="FFFFFF"/>
-                <w:position w:val="0"/>
-                <w:sz w:val="24"/>
-                <w:sz w:val="24"/>
-                <w:szCs w:val="24"/>
-                <w:u w:val="none"/>
-                <w:shd w:fill="auto" w:val="clear"/>
-                <w:vertAlign w:val="baseline"/>
-              </w:rPr>
-              <w:t>E</w:t>
-            </w:r>
-            <w:r>
-              <w:rPr>
-                <w:rFonts w:eastAsia="Arial" w:cs="Arial" w:ascii="Arial" w:hAnsi="Arial"/>
-                <w:b/>
-                <w:i w:val="false"/>
-                <w:caps w:val="false"/>
-                <w:smallCaps w:val="false"/>
-                <w:strike w:val="false"/>
-                <w:dstrike w:val="false"/>
-                <w:color w:val="FFFFFF"/>
-                <w:position w:val="0"/>
-                <w:sz w:val="24"/>
-                <w:sz w:val="24"/>
-                <w:szCs w:val="24"/>
-                <w:u w:val="none"/>
-                <w:shd w:fill="auto" w:val="clear"/>
-                <w:vertAlign w:val="baseline"/>
-              </w:rPr>
-              <w:t>scola</w:t>
-            </w:r>
-            <w:r>
-              <w:rPr>
-                <w:rFonts w:eastAsia="Arial" w:cs="Arial" w:ascii="Arial" w:hAnsi="Arial"/>
-                <w:b/>
-                <w:i w:val="false"/>
-                <w:caps w:val="false"/>
-                <w:smallCaps w:val="false"/>
-                <w:strike w:val="false"/>
-                <w:dstrike w:val="false"/>
-                <w:color w:val="FFFFFF"/>
-                <w:position w:val="0"/>
-                <w:sz w:val="24"/>
-                <w:sz w:val="24"/>
-                <w:szCs w:val="24"/>
-                <w:u w:val="none"/>
-                <w:shd w:fill="auto" w:val="clear"/>
-                <w:vertAlign w:val="baseline"/>
-              </w:rPr>
-              <w:t xml:space="preserve">} </w:t>
-            </w:r>
-            <w:r>
-              <w:rPr>
-                <w:rFonts w:eastAsia="Arial" w:cs="Arial" w:ascii="Arial" w:hAnsi="Arial"/>
-                <w:b/>
-                <w:i w:val="false"/>
-                <w:caps w:val="false"/>
-                <w:smallCaps w:val="false"/>
-                <w:strike w:val="false"/>
-                <w:dstrike w:val="false"/>
-                <w:color w:val="FFFFFF"/>
-                <w:position w:val="0"/>
-                <w:sz w:val="24"/>
-                <w:sz w:val="24"/>
-                <w:szCs w:val="24"/>
-                <w:u w:val="none"/>
-                <w:shd w:fill="auto" w:val="clear"/>
-                <w:vertAlign w:val="baseline"/>
-              </w:rPr>
-              <w:t>– {sala} - PROFª {profName}</w:t>
+              <w:t>{nomeEscola} – {sala} - PROFª {profName}</w:t>
             </w:r>
           </w:p>
           <w:p>
@@ -363,7 +203,7 @@
         </w:trPr>
         <w:tc>
           <w:tcPr>
-            <w:tcW w:w="1410" w:type="dxa"/>
+            <w:tcW w:w="2425" w:type="dxa"/>
             <w:tcBorders>
               <w:top w:val="single" w:sz="8" w:space="0" w:color="000000"/>
               <w:left w:val="single" w:sz="8" w:space="0" w:color="000000"/>
@@ -406,13 +246,53 @@
                 <w:shd w:fill="auto" w:val="clear"/>
                 <w:vertAlign w:val="baseline"/>
               </w:rPr>
-              <w:t>HORÁROS</w:t>
-            </w:r>
-          </w:p>
-        </w:tc>
-        <w:tc>
-          <w:tcPr>
-            <w:tcW w:w="3330" w:type="dxa"/>
+              <w:t>HORÁR</w:t>
+            </w:r>
+            <w:r>
+              <w:rPr>
+                <w:rFonts w:eastAsia="Arial" w:cs="Arial" w:ascii="Arial" w:hAnsi="Arial"/>
+                <w:b/>
+                <w:i w:val="false"/>
+                <w:caps w:val="false"/>
+                <w:smallCaps w:val="false"/>
+                <w:strike w:val="false"/>
+                <w:dstrike w:val="false"/>
+                <w:color w:val="000000"/>
+                <w:position w:val="0"/>
+                <w:sz w:val="24"/>
+                <w:sz w:val="24"/>
+                <w:szCs w:val="24"/>
+                <w:u w:val="none"/>
+                <w:shd w:fill="auto" w:val="clear"/>
+                <w:vertAlign w:val="baseline"/>
+              </w:rPr>
+              <w:t>I</w:t>
+            </w:r>
+            <w:r>
+              <w:rPr>
+                <w:rFonts w:eastAsia="Arial" w:cs="Arial" w:ascii="Arial" w:hAnsi="Arial"/>
+                <w:b/>
+                <w:i w:val="false"/>
+                <w:caps w:val="false"/>
+                <w:smallCaps w:val="false"/>
+                <w:strike w:val="false"/>
+                <w:dstrike w:val="false"/>
+                <w:color w:val="000000"/>
+                <w:position w:val="0"/>
+                <w:sz w:val="24"/>
+                <w:sz w:val="24"/>
+                <w:szCs w:val="24"/>
+                <w:u w:val="none"/>
+                <w:shd w:fill="auto" w:val="clear"/>
+                <w:vertAlign w:val="baseline"/>
+              </w:rPr>
+              <w:t>OS</w:t>
+            </w:r>
+          </w:p>
+        </w:tc>
+        <w:tc>
+          <w:tcPr>
+            <w:tcW w:w="2315" w:type="dxa"/>
             <w:tcBorders>
               <w:top w:val="single" w:sz="8" w:space="0" w:color="000000"/>
               <w:left w:val="single" w:sz="8" w:space="0" w:color="000000"/>
@@ -662,7 +542,7 @@
         </w:trPr>
         <w:tc>
           <w:tcPr>
-            <w:tcW w:w="1410" w:type="dxa"/>
+            <w:tcW w:w="2425" w:type="dxa"/>
             <w:tcBorders>
               <w:top w:val="single" w:sz="8" w:space="0" w:color="000000"/>
               <w:left w:val="single" w:sz="8" w:space="0" w:color="000000"/>
@@ -761,7 +641,7 @@
         </w:tc>
         <w:tc>
           <w:tcPr>
-            <w:tcW w:w="3330" w:type="dxa"/>
+            <w:tcW w:w="2315" w:type="dxa"/>
             <w:tcBorders>
               <w:top w:val="single" w:sz="8" w:space="0" w:color="000000"/>
               <w:left w:val="single" w:sz="8" w:space="0" w:color="000000"/>
@@ -995,7 +875,7 @@
         </w:trPr>
         <w:tc>
           <w:tcPr>
-            <w:tcW w:w="1410" w:type="dxa"/>
+            <w:tcW w:w="2425" w:type="dxa"/>
             <w:tcBorders>
               <w:top w:val="single" w:sz="8" w:space="0" w:color="000000"/>
               <w:left w:val="single" w:sz="8" w:space="0" w:color="000000"/>
@@ -1055,7 +935,7 @@
         </w:tc>
         <w:tc>
           <w:tcPr>
-            <w:tcW w:w="3330" w:type="dxa"/>
+            <w:tcW w:w="2315" w:type="dxa"/>
             <w:tcBorders>
               <w:top w:val="single" w:sz="8" w:space="0" w:color="000000"/>
               <w:left w:val="single" w:sz="8" w:space="0" w:color="000000"/>
@@ -1339,7 +1219,7 @@
         </w:trPr>
         <w:tc>
           <w:tcPr>
-            <w:tcW w:w="1410" w:type="dxa"/>
+            <w:tcW w:w="2425" w:type="dxa"/>
             <w:tcBorders>
               <w:top w:val="single" w:sz="8" w:space="0" w:color="000000"/>
               <w:left w:val="single" w:sz="8" w:space="0" w:color="000000"/>
@@ -1400,7 +1280,7 @@
         </w:tc>
         <w:tc>
           <w:tcPr>
-            <w:tcW w:w="3330" w:type="dxa"/>
+            <w:tcW w:w="2315" w:type="dxa"/>
             <w:tcBorders>
               <w:top w:val="single" w:sz="8" w:space="0" w:color="000000"/>
               <w:left w:val="single" w:sz="8" w:space="0" w:color="000000"/>
@@ -2996,48 +2876,10 @@
     </w:p>
     <w:p>
       <w:pPr>
-        <w:sectPr>
-          <w:type w:val="nextPage"/>
-          <w:pgSz w:orient="landscape" w:w="16838" w:h="11906"/>
-          <w:pgMar w:left="520" w:right="560" w:gutter="0" w:header="0" w:top="720" w:footer="0" w:bottom="280"/>
-          <w:pgNumType w:fmt="decimal"/>
-          <w:formProt w:val="false"/>
-          <w:textDirection w:val="lrTb"/>
-          <w:docGrid w:type="default" w:linePitch="100" w:charSpace="0"/>
-        </w:sectPr>
         <w:pStyle w:val="normal1"/>
         <w:keepNext w:val="false"/>
         <w:keepLines w:val="false"/>
         <w:widowControl w:val="false"/>
-        <w:shd w:val="clear" w:fill="auto"/>
-        <w:spacing w:lineRule="auto" w:line="276" w:before="0" w:after="0"/>
-        <w:ind w:hanging="0" w:left="0" w:right="0"/>
-        <w:jc w:val="left"/>
-        <w:rPr>
-          <w:color w:val="000000"/>
-          <w:sz w:val="20"/>
-          <w:szCs w:val="20"/>
-        </w:rPr>
-      </w:pPr>
-      <w:r>
-        <w:rPr>
-          <w:color w:val="000000"/>
-          <w:sz w:val="20"/>
-          <w:szCs w:val="20"/>
-        </w:rPr>
-      </w:r>
-      <w:r>
-        <w:br w:type="page"/>
-      </w:r>
-    </w:p>
-    <w:p>
-      <w:pPr>
-        <w:pStyle w:val="normal1"/>
-        <w:keepNext w:val="false"/>
-        <w:keepLines w:val="false"/>
-        <w:pageBreakBefore w:val="false"/>
-        <w:widowControl w:val="false"/>
-        <w:pBdr/>
         <w:shd w:val="clear" w:fill="auto"/>
         <w:spacing w:lineRule="auto" w:line="276" w:before="0" w:after="0"/>
         <w:ind w:hanging="0" w:left="0" w:right="0"/>
@@ -3081,7 +2923,7 @@
       </w:tblGrid>
       <w:tr>
         <w:trPr>
-          <w:trHeight w:val="3226" w:hRule="atLeast"/>
+          <w:trHeight w:val="10175" w:hRule="atLeast"/>
         </w:trPr>
         <w:tc>
           <w:tcPr>
@@ -3654,7 +3496,7 @@
         <w:sectPr>
           <w:type w:val="nextPage"/>
           <w:pgSz w:orient="landscape" w:w="16838" w:h="11906"/>
-          <w:pgMar w:left="520" w:right="560" w:gutter="0" w:header="0" w:top="1000" w:footer="0" w:bottom="280"/>
+          <w:pgMar w:left="520" w:right="560" w:gutter="0" w:header="0" w:top="720" w:footer="0" w:bottom="280"/>
           <w:pgNumType w:fmt="decimal"/>
           <w:formProt w:val="false"/>
           <w:textDirection w:val="lrTb"/>
@@ -4808,15 +4650,6 @@
     </w:tbl>
     <w:p>
       <w:pPr>
-        <w:sectPr>
-          <w:type w:val="nextPage"/>
-          <w:pgSz w:orient="landscape" w:w="16838" w:h="11906"/>
-          <w:pgMar w:left="520" w:right="560" w:gutter="0" w:header="0" w:top="720" w:footer="0" w:bottom="280"/>
-          <w:pgNumType w:fmt="decimal"/>
-          <w:formProt w:val="false"/>
-          <w:textDirection w:val="lrTb"/>
-          <w:docGrid w:type="default" w:linePitch="100" w:charSpace="0"/>
-        </w:sectPr>
         <w:pStyle w:val="normal1"/>
         <w:keepNext w:val="false"/>
         <w:keepLines w:val="false"/>
@@ -4853,63 +4686,11 @@
         </w:rPr>
         <w:t>OBSERVAÇÕES: AS ATIVIDADES E HORÁRIOS PODEM SER ALTERADOS SE NECESSÁRIO NO DECORRER DA SEMANA.</w:t>
       </w:r>
-      <w:r>
-        <w:br w:type="page"/>
-      </w:r>
-    </w:p>
-    <w:p>
-      <w:pPr>
-        <w:pStyle w:val="normal1"/>
-        <w:keepNext w:val="false"/>
-        <w:keepLines w:val="false"/>
-        <w:widowControl w:val="false"/>
-        <w:shd w:val="clear" w:fill="auto"/>
-        <w:spacing w:lineRule="auto" w:line="240" w:before="0" w:after="0"/>
-        <w:ind w:hanging="0" w:left="0" w:right="0"/>
-        <w:jc w:val="left"/>
-        <w:rPr>
-          <w:rFonts w:ascii="Calibri" w:hAnsi="Calibri" w:eastAsia="Calibri" w:cs="Calibri"/>
-          <w:b/>
-          <w:i w:val="false"/>
-          <w:i w:val="false"/>
-          <w:caps w:val="false"/>
-          <w:smallCaps w:val="false"/>
-          <w:strike w:val="false"/>
-          <w:dstrike w:val="false"/>
-          <w:color w:val="000000"/>
-          <w:position w:val="0"/>
-          <w:sz w:val="16"/>
-          <w:sz w:val="16"/>
-          <w:szCs w:val="16"/>
-          <w:u w:val="none"/>
-          <w:shd w:fill="auto" w:val="clear"/>
-          <w:vertAlign w:val="baseline"/>
-        </w:rPr>
-      </w:pPr>
-      <w:r>
-        <w:rPr>
-          <w:rFonts w:eastAsia="Calibri" w:cs="Calibri"/>
-          <w:b/>
-          <w:i w:val="false"/>
-          <w:caps w:val="false"/>
-          <w:smallCaps w:val="false"/>
-          <w:strike w:val="false"/>
-          <w:dstrike w:val="false"/>
-          <w:color w:val="000000"/>
-          <w:position w:val="0"/>
-          <w:sz w:val="16"/>
-          <w:sz w:val="16"/>
-          <w:szCs w:val="16"/>
-          <w:u w:val="none"/>
-          <w:shd w:fill="auto" w:val="clear"/>
-          <w:vertAlign w:val="baseline"/>
-        </w:rPr>
-      </w:r>
     </w:p>
     <w:sectPr>
       <w:type w:val="nextPage"/>
       <w:pgSz w:orient="landscape" w:w="16838" w:h="11906"/>
-      <w:pgMar w:left="520" w:right="560" w:gutter="0" w:header="0" w:top="1100" w:footer="0" w:bottom="280"/>
+      <w:pgMar w:left="520" w:right="560" w:gutter="0" w:header="0" w:top="720" w:footer="0" w:bottom="280"/>
       <w:pgNumType w:fmt="decimal"/>
       <w:formProt w:val="false"/>
       <w:textDirection w:val="lrTb"/>
@@ -4941,6 +4722,7 @@
     <w:qFormat/>
     <w:pPr>
       <w:widowControl w:val="false"/>
+      <w:suppressAutoHyphens w:val="true"/>
       <w:bidi w:val="0"/>
       <w:spacing w:before="0" w:after="0"/>
       <w:jc w:val="left"/>
@@ -5119,6 +4901,7 @@
     <w:qFormat/>
     <w:pPr>
       <w:widowControl w:val="false"/>
+      <w:suppressAutoHyphens w:val="true"/>
       <w:bidi w:val="0"/>
       <w:spacing w:before="0" w:after="0"/>
       <w:jc w:val="left"/>

</xml_diff>